<commit_message>
docs(examples): extend word formula showcase 57→67 to full command coverage
Add a "Coverage Completeness" section exercising previously-undemonstrated but
supported commands: contour integrals, limit-style operators, \limits/\nolimits,
\prod, binary operators, arrows, \boldsymbol/\mathit, \underset, relations/logic/
set symbols, \cos/\tan/\ln, and legacy {a \over b}. Kept formulas.sh/py/md in
lockstep; both drivers produce an equivalent 70-node document.
</commit_message>
<xml_diff>
--- a/examples/word/formulas.docx
+++ b/examples/word/formulas.docx
@@ -4791,6 +4791,1406 @@
         </m:sSup>
       </m:oMath>
     </w:p>
+    <w:p>
+      <w:pPr>
+        <w:pStyle w:val="Heading2"/>
+      </w:pPr>
+      <w:r>
+        <w:rPr/>
+        <w:t xml:space="preserve">X. Coverage Completeness — Additional Supported Commands</w:t>
+      </w:r>
+    </w:p>
+    <w:p>
+      <w:pPr/>
+      <w:r>
+        <w:rPr/>
+        <w:t xml:space="preserve">58. N-ary Contour Integrals (oint / oiint / oiiint):</w:t>
+      </w:r>
+    </w:p>
+    <w:p>
+      <m:oMathPara>
+        <m:oMath>
+          <m:nary>
+            <m:naryPr>
+              <m:chr m:val="∮"/>
+              <m:supHide m:val="true"/>
+            </m:naryPr>
+            <m:sub>
+              <m:r>
+                <m:t xml:space="preserve">C</m:t>
+              </m:r>
+            </m:sub>
+            <m:sup/>
+            <m:e>
+              <m:acc>
+                <m:accPr>
+                  <m:chr m:val="⃗"/>
+                </m:accPr>
+                <m:e>
+                  <m:r>
+                    <m:t xml:space="preserve">F</m:t>
+                  </m:r>
+                </m:e>
+              </m:acc>
+            </m:e>
+          </m:nary>
+          <m:r>
+            <m:t xml:space="preserve"> </m:t>
+          </m:r>
+          <m:r>
+            <m:t xml:space="preserve">·</m:t>
+          </m:r>
+          <m:r>
+            <m:t xml:space="preserve"> d</m:t>
+          </m:r>
+          <m:acc>
+            <m:accPr>
+              <m:chr m:val="⃗"/>
+            </m:accPr>
+            <m:e>
+              <m:r>
+                <m:t xml:space="preserve">r</m:t>
+              </m:r>
+            </m:e>
+          </m:acc>
+          <m:r>
+            <m:t xml:space="preserve"> = </m:t>
+          </m:r>
+          <m:nary>
+            <m:naryPr>
+              <m:chr m:val="∬"/>
+              <m:supHide m:val="true"/>
+            </m:naryPr>
+            <m:sub>
+              <m:r>
+                <m:t xml:space="preserve">S</m:t>
+              </m:r>
+            </m:sub>
+            <m:sup/>
+            <m:e>
+              <m:r>
+                <m:t xml:space="preserve">(</m:t>
+              </m:r>
+            </m:e>
+          </m:nary>
+          <m:r>
+            <m:t xml:space="preserve">∇</m:t>
+          </m:r>
+          <m:r>
+            <m:t xml:space="preserve"> </m:t>
+          </m:r>
+          <m:r>
+            <m:t xml:space="preserve">×</m:t>
+          </m:r>
+          <m:r>
+            <m:t xml:space="preserve"> </m:t>
+          </m:r>
+          <m:acc>
+            <m:accPr>
+              <m:chr m:val="⃗"/>
+            </m:accPr>
+            <m:e>
+              <m:r>
+                <m:t xml:space="preserve">F</m:t>
+              </m:r>
+            </m:e>
+          </m:acc>
+          <m:r>
+            <m:t xml:space="preserve">) </m:t>
+          </m:r>
+          <m:r>
+            <m:t xml:space="preserve">·</m:t>
+          </m:r>
+          <m:r>
+            <m:t xml:space="preserve"> d</m:t>
+          </m:r>
+          <m:acc>
+            <m:accPr>
+              <m:chr m:val="⃗"/>
+            </m:accPr>
+            <m:e>
+              <m:r>
+                <m:t xml:space="preserve">S</m:t>
+              </m:r>
+            </m:e>
+          </m:acc>
+          <m:r>
+            <m:t xml:space="preserve">, </m:t>
+          </m:r>
+          <m:r>
+            <m:t xml:space="preserve"> </m:t>
+          </m:r>
+          <m:r>
+            <m:t xml:space="preserve"> </m:t>
+          </m:r>
+          <m:nary>
+            <m:naryPr>
+              <m:chr m:val="∯"/>
+              <m:supHide m:val="true"/>
+            </m:naryPr>
+            <m:sub>
+              <m:r>
+                <m:t xml:space="preserve">S</m:t>
+              </m:r>
+            </m:sub>
+            <m:sup/>
+            <m:e>
+              <m:acc>
+                <m:accPr>
+                  <m:chr m:val="⃗"/>
+                </m:accPr>
+                <m:e>
+                  <m:r>
+                    <m:t xml:space="preserve">E</m:t>
+                  </m:r>
+                </m:e>
+              </m:acc>
+            </m:e>
+          </m:nary>
+          <m:r>
+            <m:t xml:space="preserve"> </m:t>
+          </m:r>
+          <m:r>
+            <m:t xml:space="preserve">·</m:t>
+          </m:r>
+          <m:r>
+            <m:t xml:space="preserve"> d</m:t>
+          </m:r>
+          <m:acc>
+            <m:accPr>
+              <m:chr m:val="⃗"/>
+            </m:accPr>
+            <m:e>
+              <m:r>
+                <m:t xml:space="preserve">A</m:t>
+              </m:r>
+            </m:e>
+          </m:acc>
+          <m:r>
+            <m:t xml:space="preserve"> = </m:t>
+          </m:r>
+          <m:f>
+            <m:num>
+              <m:r>
+                <m:t xml:space="preserve">Q</m:t>
+              </m:r>
+            </m:num>
+            <m:den>
+              <m:sSub>
+                <m:e>
+                  <m:r>
+                    <m:t xml:space="preserve">ε</m:t>
+                  </m:r>
+                </m:e>
+                <m:sub>
+                  <m:r>
+                    <m:t xml:space="preserve">0</m:t>
+                  </m:r>
+                </m:sub>
+              </m:sSub>
+            </m:den>
+          </m:f>
+          <m:r>
+            <m:t xml:space="preserve">, </m:t>
+          </m:r>
+          <m:r>
+            <m:t xml:space="preserve"> </m:t>
+          </m:r>
+          <m:r>
+            <m:t xml:space="preserve"> </m:t>
+          </m:r>
+          <m:nary>
+            <m:naryPr>
+              <m:chr m:val="∰"/>
+              <m:supHide m:val="true"/>
+            </m:naryPr>
+            <m:sub>
+              <m:r>
+                <m:t xml:space="preserve">V</m:t>
+              </m:r>
+            </m:sub>
+            <m:sup/>
+            <m:e>
+              <m:r>
+                <m:t xml:space="preserve">ρ</m:t>
+              </m:r>
+            </m:e>
+          </m:nary>
+          <m:r>
+            <m:t xml:space="preserve"> </m:t>
+          </m:r>
+          <m:r>
+            <m:t xml:space="preserve"> </m:t>
+          </m:r>
+          <m:r>
+            <m:t xml:space="preserve"> dV</m:t>
+          </m:r>
+        </m:oMath>
+      </m:oMathPara>
+    </w:p>
+    <w:p>
+      <w:pPr/>
+      <w:r>
+        <w:rPr/>
+        <w:t xml:space="preserve">59. Limit-style Operators with Under-limits (max / min / sup / inf):</w:t>
+      </w:r>
+    </w:p>
+    <w:p>
+      <m:oMathPara>
+        <m:oMath>
+          <m:limLow>
+            <m:limLowPr/>
+            <m:e>
+              <m:r>
+                <m:rPr>
+                  <m:nor/>
+                </m:rPr>
+                <m:t xml:space="preserve">max</m:t>
+              </m:r>
+            </m:e>
+            <m:lim>
+              <m:r>
+                <m:t xml:space="preserve">1 </m:t>
+              </m:r>
+              <m:r>
+                <m:t xml:space="preserve">≤</m:t>
+              </m:r>
+              <m:r>
+                <m:t xml:space="preserve"> i </m:t>
+              </m:r>
+              <m:r>
+                <m:t xml:space="preserve">≤</m:t>
+              </m:r>
+              <m:r>
+                <m:t xml:space="preserve"> n</m:t>
+              </m:r>
+            </m:lim>
+          </m:limLow>
+          <m:sSub>
+            <m:e>
+              <m:r>
+                <m:t xml:space="preserve"> a</m:t>
+              </m:r>
+            </m:e>
+            <m:sub>
+              <m:r>
+                <m:t xml:space="preserve">i</m:t>
+              </m:r>
+            </m:sub>
+          </m:sSub>
+          <m:r>
+            <m:t xml:space="preserve"> </m:t>
+          </m:r>
+          <m:r>
+            <m:t xml:space="preserve">≥</m:t>
+          </m:r>
+          <m:r>
+            <m:t xml:space="preserve"> </m:t>
+          </m:r>
+          <m:limLow>
+            <m:limLowPr/>
+            <m:e>
+              <m:r>
+                <m:rPr>
+                  <m:nor/>
+                </m:rPr>
+                <m:t xml:space="preserve">min</m:t>
+              </m:r>
+            </m:e>
+            <m:lim>
+              <m:r>
+                <m:t xml:space="preserve">1 </m:t>
+              </m:r>
+              <m:r>
+                <m:t xml:space="preserve">≤</m:t>
+              </m:r>
+              <m:r>
+                <m:t xml:space="preserve"> i </m:t>
+              </m:r>
+              <m:r>
+                <m:t xml:space="preserve">≤</m:t>
+              </m:r>
+              <m:r>
+                <m:t xml:space="preserve"> n</m:t>
+              </m:r>
+            </m:lim>
+          </m:limLow>
+          <m:sSub>
+            <m:e>
+              <m:r>
+                <m:t xml:space="preserve"> a</m:t>
+              </m:r>
+            </m:e>
+            <m:sub>
+              <m:r>
+                <m:t xml:space="preserve">i</m:t>
+              </m:r>
+            </m:sub>
+          </m:sSub>
+          <m:r>
+            <m:t xml:space="preserve">, </m:t>
+          </m:r>
+          <m:r>
+            <m:t xml:space="preserve"> </m:t>
+          </m:r>
+          <m:r>
+            <m:t xml:space="preserve"> </m:t>
+          </m:r>
+          <m:limLow>
+            <m:limLowPr/>
+            <m:e>
+              <m:r>
+                <m:rPr>
+                  <m:nor/>
+                </m:rPr>
+                <m:t xml:space="preserve">sup</m:t>
+              </m:r>
+            </m:e>
+            <m:lim>
+              <m:r>
+                <m:t xml:space="preserve">x </m:t>
+              </m:r>
+              <m:r>
+                <m:t xml:space="preserve">∈</m:t>
+              </m:r>
+              <m:r>
+                <m:t xml:space="preserve"> S</m:t>
+              </m:r>
+            </m:lim>
+          </m:limLow>
+          <m:r>
+            <m:t xml:space="preserve"> f(x) </m:t>
+          </m:r>
+          <m:r>
+            <m:t xml:space="preserve">≥</m:t>
+          </m:r>
+          <m:r>
+            <m:t xml:space="preserve"> </m:t>
+          </m:r>
+          <m:limLow>
+            <m:limLowPr/>
+            <m:e>
+              <m:r>
+                <m:rPr>
+                  <m:nor/>
+                </m:rPr>
+                <m:t xml:space="preserve">inf</m:t>
+              </m:r>
+            </m:e>
+            <m:lim>
+              <m:r>
+                <m:t xml:space="preserve">x </m:t>
+              </m:r>
+              <m:r>
+                <m:t xml:space="preserve">∈</m:t>
+              </m:r>
+              <m:r>
+                <m:t xml:space="preserve"> S</m:t>
+              </m:r>
+            </m:lim>
+          </m:limLow>
+          <m:r>
+            <m:t xml:space="preserve"> f(x)</m:t>
+          </m:r>
+        </m:oMath>
+      </m:oMathPara>
+    </w:p>
+    <w:p>
+      <w:pPr/>
+      <w:r>
+        <w:rPr/>
+        <w:t xml:space="preserve">60. More Limit Operators (limsup / liminf / argmax / argmin):</w:t>
+      </w:r>
+    </w:p>
+    <w:p>
+      <m:oMathPara>
+        <m:oMath>
+          <m:limLow>
+            <m:limLowPr/>
+            <m:e>
+              <m:r>
+                <m:rPr>
+                  <m:nor/>
+                </m:rPr>
+                <m:t xml:space="preserve">limsup</m:t>
+              </m:r>
+            </m:e>
+            <m:lim>
+              <m:r>
+                <m:t xml:space="preserve">n </m:t>
+              </m:r>
+              <m:r>
+                <m:t xml:space="preserve">→</m:t>
+              </m:r>
+              <m:r>
+                <m:t xml:space="preserve"> </m:t>
+              </m:r>
+              <m:r>
+                <m:t xml:space="preserve">∞</m:t>
+              </m:r>
+            </m:lim>
+          </m:limLow>
+          <m:sSub>
+            <m:e>
+              <m:r>
+                <m:t xml:space="preserve"> x</m:t>
+              </m:r>
+            </m:e>
+            <m:sub>
+              <m:r>
+                <m:t xml:space="preserve">n</m:t>
+              </m:r>
+            </m:sub>
+          </m:sSub>
+          <m:r>
+            <m:t xml:space="preserve"> </m:t>
+          </m:r>
+          <m:r>
+            <m:t xml:space="preserve">≥</m:t>
+          </m:r>
+          <m:r>
+            <m:t xml:space="preserve"> </m:t>
+          </m:r>
+          <m:limLow>
+            <m:limLowPr/>
+            <m:e>
+              <m:r>
+                <m:rPr>
+                  <m:nor/>
+                </m:rPr>
+                <m:t xml:space="preserve">liminf</m:t>
+              </m:r>
+            </m:e>
+            <m:lim>
+              <m:r>
+                <m:t xml:space="preserve">n </m:t>
+              </m:r>
+              <m:r>
+                <m:t xml:space="preserve">→</m:t>
+              </m:r>
+              <m:r>
+                <m:t xml:space="preserve"> </m:t>
+              </m:r>
+              <m:r>
+                <m:t xml:space="preserve">∞</m:t>
+              </m:r>
+            </m:lim>
+          </m:limLow>
+          <m:sSub>
+            <m:e>
+              <m:r>
+                <m:t xml:space="preserve"> x</m:t>
+              </m:r>
+            </m:e>
+            <m:sub>
+              <m:r>
+                <m:t xml:space="preserve">n</m:t>
+              </m:r>
+            </m:sub>
+          </m:sSub>
+          <m:r>
+            <m:t xml:space="preserve">, </m:t>
+          </m:r>
+          <m:r>
+            <m:t xml:space="preserve"> </m:t>
+          </m:r>
+          <m:r>
+            <m:t xml:space="preserve"> </m:t>
+          </m:r>
+          <m:acc>
+            <m:accPr>
+              <m:chr m:val="̂"/>
+            </m:accPr>
+            <m:e>
+              <m:r>
+                <m:t xml:space="preserve">θ</m:t>
+              </m:r>
+            </m:e>
+          </m:acc>
+          <m:r>
+            <m:t xml:space="preserve"> = </m:t>
+          </m:r>
+          <m:limLow>
+            <m:limLowPr/>
+            <m:e>
+              <m:r>
+                <m:rPr>
+                  <m:nor/>
+                </m:rPr>
+                <m:t xml:space="preserve">argmax</m:t>
+              </m:r>
+            </m:e>
+            <m:lim>
+              <m:r>
+                <m:t xml:space="preserve">θ</m:t>
+              </m:r>
+            </m:lim>
+          </m:limLow>
+          <m:r>
+            <m:t xml:space="preserve"> L(</m:t>
+          </m:r>
+          <m:r>
+            <m:t xml:space="preserve">θ</m:t>
+          </m:r>
+          <m:r>
+            <m:t xml:space="preserve">) = </m:t>
+          </m:r>
+          <m:limLow>
+            <m:limLowPr/>
+            <m:e>
+              <m:r>
+                <m:rPr>
+                  <m:nor/>
+                </m:rPr>
+                <m:t xml:space="preserve">argmin</m:t>
+              </m:r>
+            </m:e>
+            <m:lim>
+              <m:r>
+                <m:t xml:space="preserve">θ</m:t>
+              </m:r>
+            </m:lim>
+          </m:limLow>
+          <m:r>
+            <m:t xml:space="preserve"> (-L(</m:t>
+          </m:r>
+          <m:r>
+            <m:t xml:space="preserve">θ</m:t>
+          </m:r>
+          <m:r>
+            <m:t xml:space="preserve">))</m:t>
+          </m:r>
+        </m:oMath>
+      </m:oMathPara>
+    </w:p>
+    <w:p>
+      <w:pPr/>
+      <w:r>
+        <w:rPr/>
+        <w:t xml:space="preserve">61. Named Operators with Limits (det / gcd / Pr):</w:t>
+      </w:r>
+    </w:p>
+    <w:p>
+      <m:oMathPara>
+        <m:oMath>
+          <m:limLow>
+            <m:limLowPr/>
+            <m:e>
+              <m:r>
+                <m:rPr>
+                  <m:nor/>
+                </m:rPr>
+                <m:t xml:space="preserve">det</m:t>
+              </m:r>
+            </m:e>
+            <m:lim>
+              <m:r>
+                <m:t xml:space="preserve">A </m:t>
+              </m:r>
+              <m:r>
+                <m:t xml:space="preserve">∈</m:t>
+              </m:r>
+              <m:r>
+                <m:t xml:space="preserve"> M</m:t>
+              </m:r>
+            </m:lim>
+          </m:limLow>
+          <m:r>
+            <m:t xml:space="preserve"> A, </m:t>
+          </m:r>
+          <m:r>
+            <m:t xml:space="preserve"> </m:t>
+          </m:r>
+          <m:r>
+            <m:t xml:space="preserve"> </m:t>
+          </m:r>
+          <m:limLow>
+            <m:limLowPr/>
+            <m:e>
+              <m:r>
+                <m:rPr>
+                  <m:nor/>
+                </m:rPr>
+                <m:t xml:space="preserve">gcd</m:t>
+              </m:r>
+            </m:e>
+            <m:lim>
+              <m:r>
+                <m:t xml:space="preserve">i</m:t>
+              </m:r>
+            </m:lim>
+          </m:limLow>
+          <m:sSub>
+            <m:e>
+              <m:r>
+                <m:t xml:space="preserve"> a</m:t>
+              </m:r>
+            </m:e>
+            <m:sub>
+              <m:r>
+                <m:t xml:space="preserve">i</m:t>
+              </m:r>
+            </m:sub>
+          </m:sSub>
+          <m:r>
+            <m:t xml:space="preserve">, </m:t>
+          </m:r>
+          <m:r>
+            <m:t xml:space="preserve"> </m:t>
+          </m:r>
+          <m:r>
+            <m:t xml:space="preserve"> </m:t>
+          </m:r>
+          <m:limLow>
+            <m:limLowPr/>
+            <m:e>
+              <m:r>
+                <m:rPr>
+                  <m:nor/>
+                </m:rPr>
+                <m:t xml:space="preserve">Pr</m:t>
+              </m:r>
+            </m:e>
+            <m:lim>
+              <m:r>
+                <m:t xml:space="preserve">x </m:t>
+              </m:r>
+              <m:r>
+                <m:t xml:space="preserve">∼</m:t>
+              </m:r>
+              <m:r>
+                <m:t xml:space="preserve"> D</m:t>
+              </m:r>
+            </m:lim>
+          </m:limLow>
+          <m:r>
+            <m:t xml:space="preserve">[</m:t>
+          </m:r>
+          <m:r>
+            <m:t xml:space="preserve">X = x</m:t>
+          </m:r>
+          <m:r>
+            <m:t xml:space="preserve">]</m:t>
+          </m:r>
+        </m:oMath>
+      </m:oMathPara>
+    </w:p>
+    <w:p>
+      <w:pPr/>
+      <w:r>
+        <w:rPr/>
+        <w:t xml:space="preserve">62. Limits Placement Control (\limits / \nolimits):</w:t>
+      </w:r>
+    </w:p>
+    <w:p>
+      <m:oMathPara>
+        <m:oMath>
+          <m:limLow>
+            <m:limLowPr/>
+            <m:e>
+              <m:r>
+                <m:rPr>
+                  <m:nor/>
+                </m:rPr>
+                <m:t xml:space="preserve">lim</m:t>
+              </m:r>
+            </m:e>
+            <m:lim>
+              <m:r>
+                <m:t xml:space="preserve">x </m:t>
+              </m:r>
+              <m:r>
+                <m:t xml:space="preserve">→</m:t>
+              </m:r>
+              <m:r>
+                <m:t xml:space="preserve"> 0</m:t>
+              </m:r>
+            </m:lim>
+          </m:limLow>
+          <m:r>
+            <m:t xml:space="preserve"> </m:t>
+          </m:r>
+          <m:f>
+            <m:num>
+              <m:r>
+                <m:rPr>
+                  <m:nor/>
+                </m:rPr>
+                <m:t xml:space="preserve">sin</m:t>
+              </m:r>
+              <m:r>
+                <m:t xml:space="preserve"> x</m:t>
+              </m:r>
+            </m:num>
+            <m:den>
+              <m:r>
+                <m:t xml:space="preserve">x</m:t>
+              </m:r>
+            </m:den>
+          </m:f>
+          <m:r>
+            <m:t xml:space="preserve"> = 1, </m:t>
+          </m:r>
+          <m:r>
+            <m:t xml:space="preserve"> </m:t>
+          </m:r>
+          <m:r>
+            <m:t xml:space="preserve"> </m:t>
+          </m:r>
+          <m:nary>
+            <m:naryPr>
+              <m:chr m:val="∑"/>
+              <m:subHide m:val="true"/>
+              <m:supHide m:val="true"/>
+            </m:naryPr>
+            <m:sub/>
+            <m:sup/>
+            <m:e>
+              <m:sSubSup>
+                <m:e>
+                  <m:r>
+                    <m:t xml:space="preserve"/>
+                  </m:r>
+                </m:e>
+                <m:sub>
+                  <m:r>
+                    <m:t xml:space="preserve">i=1</m:t>
+                  </m:r>
+                </m:sub>
+                <m:sup>
+                  <m:r>
+                    <m:t xml:space="preserve">n</m:t>
+                  </m:r>
+                </m:sup>
+              </m:sSubSup>
+            </m:e>
+          </m:nary>
+          <m:r>
+            <m:t xml:space="preserve"> i = </m:t>
+          </m:r>
+          <m:f>
+            <m:num>
+              <m:r>
+                <m:t xml:space="preserve">n(n+1)</m:t>
+              </m:r>
+            </m:num>
+            <m:den>
+              <m:r>
+                <m:t xml:space="preserve">2</m:t>
+              </m:r>
+            </m:den>
+          </m:f>
+        </m:oMath>
+      </m:oMathPara>
+    </w:p>
+    <w:p>
+      <w:pPr/>
+      <w:r>
+        <w:rPr/>
+        <w:t xml:space="preserve">63. N-ary Product (prod):</w:t>
+      </w:r>
+    </w:p>
+    <w:p>
+      <m:oMathPara>
+        <m:oMath>
+          <m:r>
+            <m:t xml:space="preserve">n! = </m:t>
+          </m:r>
+          <m:nary>
+            <m:naryPr>
+              <m:chr m:val="∏"/>
+            </m:naryPr>
+            <m:sub>
+              <m:r>
+                <m:t xml:space="preserve">k=1</m:t>
+              </m:r>
+            </m:sub>
+            <m:sup>
+              <m:r>
+                <m:t xml:space="preserve">n</m:t>
+              </m:r>
+            </m:sup>
+            <m:e>
+              <m:r>
+                <m:t xml:space="preserve">k</m:t>
+              </m:r>
+            </m:e>
+          </m:nary>
+          <m:r>
+            <m:t xml:space="preserve">, </m:t>
+          </m:r>
+          <m:r>
+            <m:t xml:space="preserve"> </m:t>
+          </m:r>
+          <m:r>
+            <m:t xml:space="preserve"> </m:t>
+          </m:r>
+          <m:nary>
+            <m:naryPr>
+              <m:chr m:val="∏"/>
+              <m:supHide m:val="true"/>
+            </m:naryPr>
+            <m:sub>
+              <m:r>
+                <m:t xml:space="preserve">p </m:t>
+              </m:r>
+              <m:r>
+                <m:rPr>
+                  <m:nor/>
+                </m:rPr>
+                <m:t xml:space="preserve"> prime</m:t>
+              </m:r>
+            </m:sub>
+            <m:sup/>
+            <m:e>
+              <m:f>
+                <m:num>
+                  <m:r>
+                    <m:t xml:space="preserve">1</m:t>
+                  </m:r>
+                </m:num>
+                <m:den>
+                  <m:sSup>
+                    <m:e>
+                      <m:r>
+                        <m:t xml:space="preserve">1 - p</m:t>
+                      </m:r>
+                    </m:e>
+                    <m:sup>
+                      <m:r>
+                        <m:t xml:space="preserve">-s</m:t>
+                      </m:r>
+                    </m:sup>
+                  </m:sSup>
+                </m:den>
+              </m:f>
+            </m:e>
+          </m:nary>
+          <m:r>
+            <m:t xml:space="preserve"> = </m:t>
+          </m:r>
+          <m:r>
+            <m:t xml:space="preserve">ζ</m:t>
+          </m:r>
+          <m:r>
+            <m:t xml:space="preserve">(s)</m:t>
+          </m:r>
+        </m:oMath>
+      </m:oMathPara>
+    </w:p>
+    <w:p>
+      <w:pPr/>
+      <w:r>
+        <w:rPr/>
+        <w:t xml:space="preserve">64. Binary Operators (div / ast / star / circ / oplus / ominus / otimes / odot / bullet):</w:t>
+      </w:r>
+    </w:p>
+    <w:p>
+      <m:oMathPara>
+        <m:oMath>
+          <m:r>
+            <m:t xml:space="preserve">a </m:t>
+          </m:r>
+          <m:r>
+            <m:t xml:space="preserve">÷</m:t>
+          </m:r>
+          <m:r>
+            <m:t xml:space="preserve"> b, </m:t>
+          </m:r>
+          <m:r>
+            <m:t xml:space="preserve"> </m:t>
+          </m:r>
+          <m:r>
+            <m:t xml:space="preserve"> f </m:t>
+          </m:r>
+          <m:r>
+            <m:t xml:space="preserve">∗</m:t>
+          </m:r>
+          <m:r>
+            <m:t xml:space="preserve"> g, </m:t>
+          </m:r>
+          <m:r>
+            <m:t xml:space="preserve"> </m:t>
+          </m:r>
+          <m:r>
+            <m:t xml:space="preserve"> a </m:t>
+          </m:r>
+          <m:r>
+            <m:t xml:space="preserve">⋆</m:t>
+          </m:r>
+          <m:r>
+            <m:t xml:space="preserve"> b, </m:t>
+          </m:r>
+          <m:r>
+            <m:t xml:space="preserve"> </m:t>
+          </m:r>
+          <m:r>
+            <m:t xml:space="preserve"> f </m:t>
+          </m:r>
+          <m:r>
+            <m:t xml:space="preserve">∘</m:t>
+          </m:r>
+          <m:r>
+            <m:t xml:space="preserve"> g, </m:t>
+          </m:r>
+          <m:r>
+            <m:t xml:space="preserve"> </m:t>
+          </m:r>
+          <m:r>
+            <m:t xml:space="preserve"> a </m:t>
+          </m:r>
+          <m:r>
+            <m:t xml:space="preserve">⊕</m:t>
+          </m:r>
+          <m:r>
+            <m:t xml:space="preserve"> b </m:t>
+          </m:r>
+          <m:r>
+            <m:t xml:space="preserve">⊖</m:t>
+          </m:r>
+          <m:r>
+            <m:t xml:space="preserve"> c, </m:t>
+          </m:r>
+          <m:r>
+            <m:t xml:space="preserve"> </m:t>
+          </m:r>
+          <m:r>
+            <m:t xml:space="preserve"> u </m:t>
+          </m:r>
+          <m:r>
+            <m:t xml:space="preserve">⊗</m:t>
+          </m:r>
+          <m:r>
+            <m:t xml:space="preserve"> v </m:t>
+          </m:r>
+          <m:r>
+            <m:t xml:space="preserve">⊙</m:t>
+          </m:r>
+          <m:r>
+            <m:t xml:space="preserve"> w, </m:t>
+          </m:r>
+          <m:r>
+            <m:t xml:space="preserve"> </m:t>
+          </m:r>
+          <m:r>
+            <m:t xml:space="preserve"> x </m:t>
+          </m:r>
+          <m:r>
+            <m:t xml:space="preserve">∙</m:t>
+          </m:r>
+          <m:r>
+            <m:t xml:space="preserve"> y</m:t>
+          </m:r>
+        </m:oMath>
+      </m:oMathPara>
+    </w:p>
+    <w:p>
+      <w:pPr/>
+      <w:r>
+        <w:rPr/>
+        <w:t xml:space="preserve">65. Arrows (leftarrow / uparrow / downarrow / leftrightarrow / Rightarrow / Leftarrow / Leftrightarrow / gets / implies):</w:t>
+      </w:r>
+    </w:p>
+    <w:p>
+      <m:oMathPara>
+        <m:oMath>
+          <m:r>
+            <m:t xml:space="preserve">a </m:t>
+          </m:r>
+          <m:r>
+            <m:t xml:space="preserve">←</m:t>
+          </m:r>
+          <m:r>
+            <m:t xml:space="preserve"> b </m:t>
+          </m:r>
+          <m:r>
+            <m:t xml:space="preserve">↑</m:t>
+          </m:r>
+          <m:r>
+            <m:t xml:space="preserve"> c </m:t>
+          </m:r>
+          <m:r>
+            <m:t xml:space="preserve">↓</m:t>
+          </m:r>
+          <m:r>
+            <m:t xml:space="preserve"> d </m:t>
+          </m:r>
+          <m:r>
+            <m:t xml:space="preserve">↔</m:t>
+          </m:r>
+          <m:r>
+            <m:t xml:space="preserve"> e, </m:t>
+          </m:r>
+          <m:r>
+            <m:t xml:space="preserve"> </m:t>
+          </m:r>
+          <m:r>
+            <m:t xml:space="preserve"> P </m:t>
+          </m:r>
+          <m:r>
+            <m:t xml:space="preserve">⇒</m:t>
+          </m:r>
+          <m:r>
+            <m:t xml:space="preserve"> Q, </m:t>
+          </m:r>
+          <m:r>
+            <m:t xml:space="preserve"> </m:t>
+          </m:r>
+          <m:r>
+            <m:t xml:space="preserve"> R </m:t>
+          </m:r>
+          <m:r>
+            <m:t xml:space="preserve">⇐</m:t>
+          </m:r>
+          <m:r>
+            <m:t xml:space="preserve"> S, </m:t>
+          </m:r>
+          <m:r>
+            <m:t xml:space="preserve"> </m:t>
+          </m:r>
+          <m:r>
+            <m:t xml:space="preserve"> X </m:t>
+          </m:r>
+          <m:r>
+            <m:t xml:space="preserve">⇔</m:t>
+          </m:r>
+          <m:r>
+            <m:t xml:space="preserve"> Y, </m:t>
+          </m:r>
+          <m:r>
+            <m:t xml:space="preserve"> </m:t>
+          </m:r>
+          <m:r>
+            <m:t xml:space="preserve"> n </m:t>
+          </m:r>
+          <m:r>
+            <m:t xml:space="preserve">←</m:t>
+          </m:r>
+          <m:r>
+            <m:t xml:space="preserve"> n+1, </m:t>
+          </m:r>
+          <m:r>
+            <m:t xml:space="preserve"> </m:t>
+          </m:r>
+          <m:r>
+            <m:t xml:space="preserve"> p </m:t>
+          </m:r>
+          <m:r>
+            <m:t xml:space="preserve">⟹</m:t>
+          </m:r>
+          <m:r>
+            <m:t xml:space="preserve"> q</m:t>
+          </m:r>
+        </m:oMath>
+      </m:oMathPara>
+    </w:p>
+    <w:p>
+      <w:pPr/>
+      <w:r>
+        <w:rPr/>
+        <w:t xml:space="preserve">66. Math Fonts (boldsymbol / mathit) and Over/Under-set:</w:t>
+      </w:r>
+    </w:p>
+    <w:p>
+      <m:oMathPara>
+        <m:oMath>
+          <m:r>
+            <m:rPr>
+              <m:sty m:val="bi"/>
+            </m:rPr>
+            <m:t xml:space="preserve">α</m:t>
+          </m:r>
+          <m:r>
+            <m:t xml:space="preserve"> + </m:t>
+          </m:r>
+          <m:r>
+            <m:rPr>
+              <m:sty m:val="i"/>
+            </m:rPr>
+            <m:t xml:space="preserve">xyz</m:t>
+          </m:r>
+          <m:r>
+            <m:t xml:space="preserve">, </m:t>
+          </m:r>
+          <m:r>
+            <m:t xml:space="preserve"> </m:t>
+          </m:r>
+          <m:r>
+            <m:t xml:space="preserve"> </m:t>
+          </m:r>
+          <m:limUpp>
+            <m:limUppPr/>
+            <m:e>
+              <m:r>
+                <m:t xml:space="preserve">=</m:t>
+              </m:r>
+            </m:e>
+            <m:lim>
+              <m:r>
+                <m:t xml:space="preserve">!</m:t>
+              </m:r>
+            </m:lim>
+          </m:limUpp>
+          <m:r>
+            <m:t xml:space="preserve"> </m:t>
+          </m:r>
+          <m:r>
+            <m:t xml:space="preserve"> </m:t>
+          </m:r>
+          <m:r>
+            <m:t xml:space="preserve"> </m:t>
+          </m:r>
+          <m:limLow>
+            <m:limLowPr/>
+            <m:e>
+              <m:r>
+                <m:rPr>
+                  <m:nor/>
+                </m:rPr>
+                <m:t xml:space="preserve">lim</m:t>
+              </m:r>
+            </m:e>
+            <m:lim>
+              <m:r>
+                <m:t xml:space="preserve">n </m:t>
+              </m:r>
+              <m:r>
+                <m:t xml:space="preserve">→</m:t>
+              </m:r>
+              <m:r>
+                <m:t xml:space="preserve"> </m:t>
+              </m:r>
+              <m:r>
+                <m:t xml:space="preserve">∞</m:t>
+              </m:r>
+            </m:lim>
+          </m:limLow>
+          <m:sSub>
+            <m:e>
+              <m:r>
+                <m:t xml:space="preserve"> a</m:t>
+              </m:r>
+            </m:e>
+            <m:sub>
+              <m:r>
+                <m:t xml:space="preserve">n</m:t>
+              </m:r>
+            </m:sub>
+          </m:sSub>
+        </m:oMath>
+      </m:oMathPara>
+    </w:p>
+    <w:p>
+      <w:pPr/>
+      <w:r>
+        <w:rPr/>
+        <w:t xml:space="preserve">67. Relations, Logic, Sets, Trig, and Legacy Fraction (\neq / \sim / \subset / \lor / \neg / \wedge / \parallel / \varnothing / \complement / \cos / \tan / \ln / {a \over b}):</w:t>
+      </w:r>
+    </w:p>
+    <w:p>
+      <m:oMathPara>
+        <m:oMath>
+          <m:r>
+            <m:t xml:space="preserve">a </m:t>
+          </m:r>
+          <m:r>
+            <m:t xml:space="preserve">≠</m:t>
+          </m:r>
+          <m:r>
+            <m:t xml:space="preserve"> b </m:t>
+          </m:r>
+          <m:r>
+            <m:t xml:space="preserve">∼</m:t>
+          </m:r>
+          <m:r>
+            <m:t xml:space="preserve"> c, </m:t>
+          </m:r>
+          <m:r>
+            <m:t xml:space="preserve"> </m:t>
+          </m:r>
+          <m:r>
+            <m:t xml:space="preserve"> A </m:t>
+          </m:r>
+          <m:r>
+            <m:t xml:space="preserve">⊂</m:t>
+          </m:r>
+          <m:r>
+            <m:t xml:space="preserve"> B </m:t>
+          </m:r>
+          <m:r>
+            <m:t xml:space="preserve">⊃</m:t>
+          </m:r>
+          <m:r>
+            <m:t xml:space="preserve"> C, </m:t>
+          </m:r>
+          <m:r>
+            <m:t xml:space="preserve"> </m:t>
+          </m:r>
+          <m:r>
+            <m:t xml:space="preserve"> p </m:t>
+          </m:r>
+          <m:r>
+            <m:t xml:space="preserve">∨</m:t>
+          </m:r>
+          <m:r>
+            <m:t xml:space="preserve"> </m:t>
+          </m:r>
+          <m:r>
+            <m:t xml:space="preserve">¬</m:t>
+          </m:r>
+          <m:r>
+            <m:t xml:space="preserve"> q </m:t>
+          </m:r>
+          <m:r>
+            <m:t xml:space="preserve">∧</m:t>
+          </m:r>
+          <m:r>
+            <m:t xml:space="preserve"> r, </m:t>
+          </m:r>
+          <m:r>
+            <m:t xml:space="preserve"> </m:t>
+          </m:r>
+          <m:r>
+            <m:t xml:space="preserve"> u </m:t>
+          </m:r>
+          <m:r>
+            <m:t xml:space="preserve">∨</m:t>
+          </m:r>
+          <m:r>
+            <m:t xml:space="preserve"> v, </m:t>
+          </m:r>
+          <m:r>
+            <m:t xml:space="preserve"> </m:t>
+          </m:r>
+          <m:r>
+            <m:t xml:space="preserve"> </m:t>
+          </m:r>
+          <m:sSub>
+            <m:e>
+              <m:r>
+                <m:t xml:space="preserve">\ell</m:t>
+              </m:r>
+            </m:e>
+            <m:sub>
+              <m:r>
+                <m:t xml:space="preserve">1</m:t>
+              </m:r>
+            </m:sub>
+          </m:sSub>
+          <m:r>
+            <m:t xml:space="preserve"> </m:t>
+          </m:r>
+          <m:r>
+            <m:t xml:space="preserve">∥</m:t>
+          </m:r>
+          <m:r>
+            <m:t xml:space="preserve"> </m:t>
+          </m:r>
+          <m:sSub>
+            <m:e>
+              <m:r>
+                <m:t xml:space="preserve">\ell</m:t>
+              </m:r>
+            </m:e>
+            <m:sub>
+              <m:r>
+                <m:t xml:space="preserve">2</m:t>
+              </m:r>
+            </m:sub>
+          </m:sSub>
+          <m:r>
+            <m:t xml:space="preserve">, </m:t>
+          </m:r>
+          <m:r>
+            <m:t xml:space="preserve"> </m:t>
+          </m:r>
+          <m:r>
+            <m:t xml:space="preserve"> </m:t>
+          </m:r>
+          <m:r>
+            <m:t xml:space="preserve">∅</m:t>
+          </m:r>
+          <m:r>
+            <m:t xml:space="preserve"> = </m:t>
+          </m:r>
+          <m:sSub>
+            <m:e>
+              <m:r>
+                <m:t xml:space="preserve">∁</m:t>
+              </m:r>
+            </m:e>
+            <m:sub>
+              <m:r>
+                <m:t xml:space="preserve">U</m:t>
+              </m:r>
+            </m:sub>
+          </m:sSub>
+          <m:r>
+            <m:t xml:space="preserve"> U, </m:t>
+          </m:r>
+          <m:r>
+            <m:t xml:space="preserve"> </m:t>
+          </m:r>
+          <m:r>
+            <m:t xml:space="preserve"> </m:t>
+          </m:r>
+          <m:sSup>
+            <m:e>
+              <m:r>
+                <m:rPr>
+                  <m:nor/>
+                </m:rPr>
+                <m:t xml:space="preserve">cos</m:t>
+              </m:r>
+            </m:e>
+            <m:sup>
+              <m:r>
+                <m:t xml:space="preserve">2</m:t>
+              </m:r>
+            </m:sup>
+          </m:sSup>
+          <m:r>
+            <m:t xml:space="preserve"> x + </m:t>
+          </m:r>
+          <m:r>
+            <m:rPr>
+              <m:nor/>
+            </m:rPr>
+            <m:t xml:space="preserve">tan</m:t>
+          </m:r>
+          <m:r>
+            <m:t xml:space="preserve"> x - </m:t>
+          </m:r>
+          <m:r>
+            <m:rPr>
+              <m:nor/>
+            </m:rPr>
+            <m:t xml:space="preserve">ln</m:t>
+          </m:r>
+          <m:r>
+            <m:t xml:space="preserve"> x, </m:t>
+          </m:r>
+          <m:r>
+            <m:t xml:space="preserve"> </m:t>
+          </m:r>
+          <m:r>
+            <m:t xml:space="preserve"> </m:t>
+          </m:r>
+          <m:f>
+            <m:num>
+              <m:r>
+                <m:t xml:space="preserve">a</m:t>
+              </m:r>
+            </m:num>
+            <m:den>
+              <m:r>
+                <m:t xml:space="preserve">b</m:t>
+              </m:r>
+            </m:den>
+          </m:f>
+        </m:oMath>
+      </m:oMathPara>
+    </w:p>
     <w:sectPr>
       <w:pgSz w:w="11906" w:h="16838"/>
       <w:pgMar w:top="1440" w:right="1800" w:bottom="1440" w:left="1800"/>

</xml_diff>

<commit_message>
docs(examples): formulas — add \nparallel (parser surface now 0 uncovered)
With the \nparallel forward mapping fixed, include it in the negated-relations
equation. The example now demonstrates every command the parser recognizes
(still-missing count 1 → 0); the earlier "nparallel unsupported" note is
replaced with the round-trip explanation. Regenerated, validates clean.
</commit_message>
<xml_diff>
--- a/examples/word/formulas.docx
+++ b/examples/word/formulas.docx
@@ -6592,6 +6592,18 @@
             <m:t xml:space="preserve"> </m:t>
           </m:r>
           <m:r>
+            <m:t xml:space="preserve"> g </m:t>
+          </m:r>
+          <m:r>
+            <m:t xml:space="preserve">∦</m:t>
+          </m:r>
+          <m:r>
+            <m:t xml:space="preserve"> h, </m:t>
+          </m:r>
+          <m:r>
+            <m:t xml:space="preserve"> </m:t>
+          </m:r>
+          <m:r>
             <m:t xml:space="preserve"> A </m:t>
           </m:r>
           <m:r>

</xml_diff>